<commit_message>
Update prompt submission docx with Google Gemini AI integration and FurBuddy telemetry calibration
</commit_message>
<xml_diff>
--- a/MFC_A2_Prompts_Submission.docx
+++ b/MFC_A2_Prompts_Submission.docx
@@ -1188,6 +1188,68 @@
           </w:p>
         </w:tc>
       </w:tr>
+      <w:tr>
+        <w:tc>
+          <w:tcPr>
+            <w:tcW w:type="dxa" w:w="1728"/>
+            <w:shd w:val="clear" w:color="auto" w:fill="F8FAFC"/>
+          </w:tcPr>
+          <w:p>
+            <w:pPr>
+              <w:spacing w:before="60" w:after="60"/>
+            </w:pPr>
+            <w:r>
+              <w:rPr>
+                <w:rFonts w:ascii="Arial" w:hAnsi="Arial"/>
+                <w:b/>
+                <w:color w:val="2563EB"/>
+                <w:sz w:val="18"/>
+              </w:rPr>
+              <w:t>Prompt 11</w:t>
+            </w:r>
+          </w:p>
+        </w:tc>
+        <w:tc>
+          <w:tcPr>
+            <w:tcW w:type="dxa" w:w="3168"/>
+            <w:shd w:val="clear" w:color="auto" w:fill="F8FAFC"/>
+          </w:tcPr>
+          <w:p>
+            <w:pPr>
+              <w:spacing w:before="60" w:after="60"/>
+            </w:pPr>
+            <w:r>
+              <w:rPr>
+                <w:rFonts w:ascii="Arial" w:hAnsi="Arial"/>
+                <w:b w:val="0"/>
+                <w:color w:val="334155"/>
+                <w:sz w:val="18"/>
+              </w:rPr>
+              <w:t>Live Google Gemini AI Integration &amp; Telemetry Sync</w:t>
+            </w:r>
+          </w:p>
+        </w:tc>
+        <w:tc>
+          <w:tcPr>
+            <w:tcW w:type="dxa" w:w="4896"/>
+            <w:shd w:val="clear" w:color="auto" w:fill="F8FAFC"/>
+          </w:tcPr>
+          <w:p>
+            <w:pPr>
+              <w:spacing w:before="60" w:after="60"/>
+            </w:pPr>
+            <w:r>
+              <w:rPr>
+                <w:rFonts w:ascii="Arial" w:hAnsi="Arial"/>
+                <w:b w:val="0"/>
+                <w:color w:val="334155"/>
+                <w:sz w:val="18"/>
+              </w:rPr>
+              <w:t>Connected real Google Gemini AI (AI Studio) to web app; calibrated operational telemetry (86.3% on-time delivery, win rate, margins) and enhanced FurBuddy conversational persona.</w:t>
+            </w:r>
+          </w:p>
+        </w:tc>
+      </w:tr>
     </w:tbl>
     <w:p>
       <w:pPr>
@@ -3098,6 +3160,239 @@
     </w:p>
     <w:p>
       <w:pPr>
+        <w:spacing w:before="280" w:after="40"/>
+      </w:pPr>
+      <w:r>
+        <w:rPr>
+          <w:rFonts w:ascii="Arial" w:hAnsi="Arial"/>
+          <w:b/>
+          <w:color w:val="0F172A"/>
+          <w:sz w:val="24"/>
+        </w:rPr>
+        <w:t>Prompt 11: Real Google Gemini Generative AI Integration &amp; Telemetry Calibration (FurBuddy)</w:t>
+      </w:r>
+    </w:p>
+    <w:p>
+      <w:pPr>
+        <w:spacing w:before="0" w:after="120"/>
+      </w:pPr>
+      <w:r>
+        <w:rPr>
+          <w:rFonts w:ascii="Arial" w:hAnsi="Arial"/>
+          <w:i/>
+          <w:color w:val="64748B"/>
+          <w:sz w:val="18"/>
+        </w:rPr>
+        <w:t>Step Index: 334  •  Recorded At: 2026-09-23T13:14:37Z</w:t>
+      </w:r>
+    </w:p>
+    <w:tbl>
+      <w:tblPr>
+        <w:tblW w:type="auto" w:w="0"/>
+        <w:tblLook w:firstColumn="1" w:firstRow="1" w:lastColumn="0" w:lastRow="0" w:noHBand="0" w:noVBand="1" w:val="04A0"/>
+      </w:tblPr>
+      <w:tblGrid>
+        <w:gridCol w:w="9792"/>
+      </w:tblGrid>
+      <w:tr>
+        <w:tc>
+          <w:tcPr>
+            <w:tcW w:type="dxa" w:w="9792"/>
+            <w:shd w:val="clear" w:color="auto" w:fill="F1F5F9"/>
+            <w:tcMar>
+              <w:top w:w="120" w:type="dxa"/>
+              <w:left w:w="160" w:type="dxa"/>
+              <w:bottom w:w="120" w:type="dxa"/>
+              <w:right w:w="160" w:type="dxa"/>
+            </w:tcMar>
+            <w:tcBorders>
+              <w:top w:val="single" w:sz="4" w:space="0" w:color="E2E8F0"/>
+              <w:left w:val="single" w:sz="18" w:space="0" w:color="3B82F6"/>
+              <w:bottom w:val="single" w:sz="4" w:space="0" w:color="E2E8F0"/>
+              <w:right w:val="single" w:sz="4" w:space="0" w:color="E2E8F0"/>
+            </w:tcBorders>
+          </w:tcPr>
+          <w:p>
+            <w:pPr>
+              <w:spacing w:before="40" w:after="40"/>
+            </w:pPr>
+            <w:r>
+              <w:rPr>
+                <w:rFonts w:ascii="Arial" w:hAnsi="Arial"/>
+                <w:b/>
+                <w:color w:val="1E293B"/>
+                <w:sz w:val="18"/>
+              </w:rPr>
+              <w:t>USER PROMPT TEXT:</w:t>
+              <w:br/>
+            </w:r>
+            <w:r>
+              <w:rPr>
+                <w:rFonts w:ascii="Arial" w:hAnsi="Arial"/>
+                <w:color w:val="0F172A"/>
+                <w:sz w:val="18"/>
+              </w:rPr>
+              <w:t>the FurBuddy answer somehow wrong!!! can you fix? I need the chatbot to answer correctly and somehow sounds friendly, not just answer like that</w:t>
+              <w:br/>
+              <w:t>[Follow-up Deploy Directive: "well i think you haven't push on github and i also haven't change the file to deploy"]</w:t>
+            </w:r>
+          </w:p>
+        </w:tc>
+      </w:tr>
+    </w:tbl>
+    <w:p>
+      <w:pPr>
+        <w:spacing w:before="120" w:after="80"/>
+      </w:pPr>
+      <w:r>
+        <w:rPr>
+          <w:rFonts w:ascii="Arial" w:hAnsi="Arial"/>
+          <w:b/>
+          <w:color w:val="334155"/>
+          <w:sz w:val="19"/>
+        </w:rPr>
+        <w:t xml:space="preserve">Context &amp; Rationale: </w:t>
+      </w:r>
+      <w:r>
+        <w:rPr>
+          <w:rFonts w:ascii="Arial" w:hAnsi="Arial"/>
+          <w:color w:val="334155"/>
+          <w:sz w:val="19"/>
+        </w:rPr>
+        <w:t>Integration and validation testing of the live Generative AI intelligence agent (FurBuddy) revealed two major operational defects: (1) Telemetry Synchronization Bug: while Gemini models were connected via the Google AI Studio REST API, property name discrepancies in the injected context passed 0.0% for on-time delivery rate (instead of the verified 86.3%), 0 delivered orders, and 0.0% net margin, causing Gemini to hallucinate that MFC had zero completed deliveries. (2) Rigid &amp; Robotic Persona: The assistant recited raw database metrics in bulk instead of warmly, directly, and conversationally addressing the operations manager's inquiry.</w:t>
+      </w:r>
+    </w:p>
+    <w:p>
+      <w:pPr>
+        <w:spacing w:before="80" w:after="80"/>
+      </w:pPr>
+      <w:r>
+        <w:rPr>
+          <w:rFonts w:ascii="Arial" w:hAnsi="Arial"/>
+          <w:b/>
+          <w:color w:val="334155"/>
+          <w:sz w:val="19"/>
+        </w:rPr>
+        <w:t>Key Technical Actions &amp; Outcomes:</w:t>
+      </w:r>
+    </w:p>
+    <w:p>
+      <w:pPr>
+        <w:pStyle w:val="ListBullet"/>
+        <w:spacing w:before="40" w:after="60"/>
+      </w:pPr>
+      <w:r>
+        <w:rPr>
+          <w:rFonts w:ascii="Arial" w:hAnsi="Arial"/>
+          <w:b/>
+          <w:color w:val="334155"/>
+          <w:sz w:val="18"/>
+        </w:rPr>
+        <w:t xml:space="preserve">Direct Google Gemini REST API Client: </w:t>
+      </w:r>
+      <w:r>
+        <w:rPr>
+          <w:rFonts w:ascii="Arial" w:hAnsi="Arial"/>
+          <w:color w:val="475569"/>
+          <w:sz w:val="18"/>
+        </w:rPr>
+        <w:t>Integrated the browser client directly to the Google Generative Language API (v1beta/models/{model}:generateContent) with an in-app API Key modal, persistent browser localStorage encryption, and immediate offline fallback capability.</w:t>
+      </w:r>
+    </w:p>
+    <w:p>
+      <w:pPr>
+        <w:pStyle w:val="ListBullet"/>
+        <w:spacing w:before="40" w:after="60"/>
+      </w:pPr>
+      <w:r>
+        <w:rPr>
+          <w:rFonts w:ascii="Arial" w:hAnsi="Arial"/>
+          <w:b/>
+          <w:color w:val="334155"/>
+          <w:sz w:val="18"/>
+        </w:rPr>
+        <w:t xml:space="preserve">Live Model Discovery &amp; Smart Failover: </w:t>
+      </w:r>
+      <w:r>
+        <w:rPr>
+          <w:rFonts w:ascii="Arial" w:hAnsi="Arial"/>
+          <w:color w:val="475569"/>
+          <w:sz w:val="18"/>
+        </w:rPr>
+        <w:t>Engineered automated endpoint querying (v1beta/models) to discover active Google AI models on the user's account (prioritizing gemini-2.5-flash, gemini-3.5-flash-lite, gemini-1.5-flash) with seamless multi-model fallback on rate-limits or deprecations.</w:t>
+      </w:r>
+    </w:p>
+    <w:p>
+      <w:pPr>
+        <w:pStyle w:val="ListBullet"/>
+        <w:spacing w:before="40" w:after="60"/>
+      </w:pPr>
+      <w:r>
+        <w:rPr>
+          <w:rFonts w:ascii="Arial" w:hAnsi="Arial"/>
+          <w:b/>
+          <w:color w:val="334155"/>
+          <w:sz w:val="18"/>
+        </w:rPr>
+        <w:t xml:space="preserve">Operational Telemetry Grounding &amp; Metric Fix: </w:t>
+      </w:r>
+      <w:r>
+        <w:rPr>
+          <w:rFonts w:ascii="Arial" w:hAnsi="Arial"/>
+          <w:color w:val="475569"/>
+          <w:sz w:val="18"/>
+        </w:rPr>
+        <w:t>Corrected METRICS property mapping (onTimePct vs onTimeRate, delivered vs deliveredOrders, profitMargin vs margin). Grounded the prompt with verified figures: 86.3% on-time delivery rate (397 on time / 63 late out of 460 delivered orders), 39.5% win rate (460 delivered / 1,166 quotes), 4.2% net profit margin ($208.5k profit on $4,988.9k rev), 24.1h joinery bottleneck (~43% of stage hours), and authentic timber stock levels.</w:t>
+      </w:r>
+    </w:p>
+    <w:p>
+      <w:pPr>
+        <w:pStyle w:val="ListBullet"/>
+        <w:spacing w:before="40" w:after="60"/>
+      </w:pPr>
+      <w:r>
+        <w:rPr>
+          <w:rFonts w:ascii="Arial" w:hAnsi="Arial"/>
+          <w:b/>
+          <w:color w:val="334155"/>
+          <w:sz w:val="18"/>
+        </w:rPr>
+        <w:t xml:space="preserve">Warm Conversational Persona &amp; Focused Evidence: </w:t>
+      </w:r>
+      <w:r>
+        <w:rPr>
+          <w:rFonts w:ascii="Arial" w:hAnsi="Arial"/>
+          <w:color w:val="475569"/>
+          <w:sz w:val="18"/>
+        </w:rPr>
+        <w:t>Upgraded prompt engineering to establish FurBuddy as a friendly, supportive executive AI partner ("FurBuddy 🐾"). Enforced strict query-relevance in the 📊 EVIDENCE block so it directly answers the user's question without dumping irrelevant database metrics, and added natural 1-sentence headline openers and proactive strategic follow-up offers.</w:t>
+      </w:r>
+    </w:p>
+    <w:p>
+      <w:pPr>
+        <w:pStyle w:val="ListBullet"/>
+        <w:spacing w:before="40" w:after="60"/>
+      </w:pPr>
+      <w:r>
+        <w:rPr>
+          <w:rFonts w:ascii="Arial" w:hAnsi="Arial"/>
+          <w:b/>
+          <w:color w:val="334155"/>
+          <w:sz w:val="18"/>
+        </w:rPr>
+        <w:t xml:space="preserve">Dual-Engine Harmonization &amp; Production Deployment: </w:t>
+      </w:r>
+      <w:r>
+        <w:rPr>
+          <w:rFonts w:ascii="Arial" w:hAnsi="Arial"/>
+          <w:color w:val="475569"/>
+          <w:sz w:val="18"/>
+        </w:rPr>
+        <w:t>Harmonized both live Gemini and offline fallback engines to adhere to identical 4-part managerial cards (Evidence -&gt; Interpretation -&gt; Strategic Action -&gt; Limitation &amp; Assumption). Added cache-busting (?v=2.1) to index.html and committed/pushed verified code to the production GitHub repository for live deployment.</w:t>
+      </w:r>
+    </w:p>
+    <w:p>
+      <w:pPr>
         <w:pStyle w:val="Heading1"/>
         <w:spacing w:before="320" w:after="120"/>
       </w:pPr>
@@ -3258,6 +3553,29 @@
           <w:sz w:val="18"/>
         </w:rPr>
         <w:t>Helpful / Not Helpful rating buttons with multi-option error follow-ups, persisted locally to browser storage for ongoing quality improvement.</w:t>
+      </w:r>
+    </w:p>
+    <w:p>
+      <w:pPr>
+        <w:pStyle w:val="ListBullet"/>
+        <w:spacing w:before="40" w:after="60"/>
+      </w:pPr>
+      <w:r>
+        <w:rPr>
+          <w:rFonts w:ascii="Arial" w:hAnsi="Arial"/>
+          <w:b/>
+          <w:color w:val="334155"/>
+          <w:sz w:val="18"/>
+        </w:rPr>
+        <w:t xml:space="preserve">Live Google Gemini Generative AI Integration (FurBuddy): </w:t>
+      </w:r>
+      <w:r>
+        <w:rPr>
+          <w:rFonts w:ascii="Arial" w:hAnsi="Arial"/>
+          <w:color w:val="475569"/>
+          <w:sz w:val="18"/>
+        </w:rPr>
+        <w:t>Direct Google AI Studio REST API client with live model discovery, multi-model fallback, client-side API key management, operational simulator telemetry synchronization (86.3% on-time delivery, 39.5% win rate, 4.2% margin), and warm conversational 4-part managerial intelligence framework (Evidence -&gt; Interpretation -&gt; Action -&gt; Limitation).</w:t>
       </w:r>
     </w:p>
     <w:sectPr>

</xml_diff>

<commit_message>
feat: implement preWIP bands, commitment risk page, self-check, and AI intent updates
</commit_message>
<xml_diff>
--- a/MFC_A2_Prompts_Submission.docx
+++ b/MFC_A2_Prompts_Submission.docx
@@ -147,7 +147,7 @@
                 <w:color w:val="0F172A"/>
                 <w:sz w:val="19"/>
               </w:rPr>
-              <w:t>AnalyticsMCF (http://localhost:3000)</w:t>
+              <w:t xml:space="preserve">AnalyticsMCF </w:t>
             </w:r>
           </w:p>
         </w:tc>
@@ -259,7 +259,23 @@
                 <w:color w:val="0F172A"/>
                 <w:sz w:val="19"/>
               </w:rPr>
-              <w:t>September 21, 2026 · 09:24 PM</w:t>
+              <w:t>September 2</w:t>
+            </w:r>
+            <w:r>
+              <w:rPr>
+                <w:rFonts w:ascii="Arial" w:hAnsi="Arial"/>
+                <w:color w:val="0F172A"/>
+                <w:sz w:val="19"/>
+              </w:rPr>
+              <w:t>3</w:t>
+            </w:r>
+            <w:r>
+              <w:rPr>
+                <w:rFonts w:ascii="Arial" w:hAnsi="Arial"/>
+                <w:color w:val="0F172A"/>
+                <w:sz w:val="19"/>
+              </w:rPr>
+              <w:t>, 2026 · 09:24 PM</w:t>
             </w:r>
           </w:p>
         </w:tc>
@@ -1189,9 +1205,12 @@
         </w:tc>
       </w:tr>
       <w:tr>
+        <w:trPr>
+          <w:jc w:val="center"/>
+        </w:trPr>
         <w:tc>
           <w:tcPr>
-            <w:tcW w:type="dxa" w:w="1728"/>
+            <w:tcW w:w="1728" w:type="dxa"/>
             <w:shd w:val="clear" w:color="auto" w:fill="F8FAFC"/>
           </w:tcPr>
           <w:p>
@@ -1211,7 +1230,7 @@
         </w:tc>
         <w:tc>
           <w:tcPr>
-            <w:tcW w:type="dxa" w:w="3168"/>
+            <w:tcW w:w="3168" w:type="dxa"/>
             <w:shd w:val="clear" w:color="auto" w:fill="F8FAFC"/>
           </w:tcPr>
           <w:p>
@@ -1221,7 +1240,6 @@
             <w:r>
               <w:rPr>
                 <w:rFonts w:ascii="Arial" w:hAnsi="Arial"/>
-                <w:b w:val="0"/>
                 <w:color w:val="334155"/>
                 <w:sz w:val="18"/>
               </w:rPr>
@@ -1231,7 +1249,7 @@
         </w:tc>
         <w:tc>
           <w:tcPr>
-            <w:tcW w:type="dxa" w:w="4896"/>
+            <w:tcW w:w="4896" w:type="dxa"/>
             <w:shd w:val="clear" w:color="auto" w:fill="F8FAFC"/>
           </w:tcPr>
           <w:p>
@@ -1241,7 +1259,6 @@
             <w:r>
               <w:rPr>
                 <w:rFonts w:ascii="Arial" w:hAnsi="Arial"/>
-                <w:b w:val="0"/>
                 <w:color w:val="334155"/>
                 <w:sz w:val="18"/>
               </w:rPr>
@@ -1266,6 +1283,7 @@
           <w:rFonts w:ascii="Arial" w:hAnsi="Arial"/>
           <w:color w:val="0F172A"/>
         </w:rPr>
+        <w:lastRenderedPageBreak/>
         <w:t>2. Detailed Chronological Prompt &amp; Response Transcript</w:t>
       </w:r>
     </w:p>
@@ -1294,7 +1312,6 @@
           <w:color w:val="64748B"/>
           <w:sz w:val="18"/>
         </w:rPr>
-        <w:lastRenderedPageBreak/>
         <w:t>Step Index: 0  ·  Recorded At: 2026-09-21T23:56:30Z</w:t>
       </w:r>
     </w:p>
@@ -1351,25 +1368,7 @@
                 <w:color w:val="0F172A"/>
                 <w:sz w:val="18"/>
               </w:rPr>
-              <w:t xml:space="preserve">basically, read the A2 requirement first, I need to build an web app. We already have a data sets too. I need you to build </w:t>
-            </w:r>
-            <w:proofErr w:type="gramStart"/>
-            <w:r>
-              <w:rPr>
-                <w:rFonts w:ascii="Consolas" w:hAnsi="Consolas"/>
-                <w:color w:val="0F172A"/>
-                <w:sz w:val="18"/>
-              </w:rPr>
-              <w:t>an</w:t>
-            </w:r>
-            <w:proofErr w:type="gramEnd"/>
-            <w:r>
-              <w:rPr>
-                <w:rFonts w:ascii="Consolas" w:hAnsi="Consolas"/>
-                <w:color w:val="0F172A"/>
-                <w:sz w:val="18"/>
-              </w:rPr>
-              <w:t xml:space="preserve"> web app</w:t>
+              <w:t>basically, read the A2 requirement first, I need to build an web app. We already have a data sets too. I need you to build an web app</w:t>
             </w:r>
             <w:r>
               <w:rPr>
@@ -1452,25 +1451,7 @@
           <w:color w:val="475569"/>
           <w:sz w:val="18"/>
         </w:rPr>
-        <w:t xml:space="preserve">Explored the reference web </w:t>
-      </w:r>
-      <w:proofErr w:type="gramStart"/>
-      <w:r>
-        <w:rPr>
-          <w:rFonts w:ascii="Arial" w:hAnsi="Arial"/>
-          <w:color w:val="475569"/>
-          <w:sz w:val="18"/>
-        </w:rPr>
-        <w:t>app at</w:t>
-      </w:r>
-      <w:proofErr w:type="gramEnd"/>
-      <w:r>
-        <w:rPr>
-          <w:rFonts w:ascii="Arial" w:hAnsi="Arial"/>
-          <w:color w:val="475569"/>
-          <w:sz w:val="18"/>
-        </w:rPr>
-        <w:t xml:space="preserve"> via browser inspection.</w:t>
+        <w:t>Explored the reference web app at via browser inspection.</w:t>
       </w:r>
     </w:p>
     <w:p>
@@ -1948,6 +1929,7 @@
                 <w:color w:val="0F172A"/>
                 <w:sz w:val="18"/>
               </w:rPr>
+              <w:lastRenderedPageBreak/>
               <w:t>Oh no no I think it goes wrong! My teacher was explicit: "do not re-run the simulator, staff already generated the dataset, download and use those CSVs directly," and "provided dataset must be used." That means your app should come pre-loaded with the real MFC data and be ready to analyze the moment it opens, not force a manual upload step before anything works.</w:t>
             </w:r>
           </w:p>
@@ -2381,6 +2363,7 @@
           <w:color w:val="475569"/>
           <w:sz w:val="18"/>
         </w:rPr>
+        <w:lastRenderedPageBreak/>
         <w:t>Engineered the Present Operations Board (Workshop Stage -&gt; Product -&gt; Order -&gt; Risk Badge).</w:t>
       </w:r>
     </w:p>
@@ -2423,7 +2406,6 @@
           <w:color w:val="0F172A"/>
           <w:sz w:val="24"/>
         </w:rPr>
-        <w:lastRenderedPageBreak/>
         <w:t xml:space="preserve">Prompt </w:t>
       </w:r>
       <w:r>
@@ -2975,6 +2957,7 @@
           <w:color w:val="475569"/>
           <w:sz w:val="18"/>
         </w:rPr>
+        <w:lastRenderedPageBreak/>
         <w:t>Sidebar &amp; Layout Fix: Added a scrollable &lt;nav class='sidebar-nav'&gt; with flex-shrink: 0 and structured section labels so all 9 sections (including Ask AI) are accessible on any screen height without squashing.</w:t>
       </w:r>
     </w:p>
@@ -3017,7 +3000,6 @@
           <w:color w:val="0F172A"/>
           <w:sz w:val="24"/>
         </w:rPr>
-        <w:lastRenderedPageBreak/>
         <w:t>Prompt 10: Official Submission Compilation</w:t>
       </w:r>
     </w:p>
@@ -3174,7 +3156,7 @@
     </w:p>
     <w:p>
       <w:pPr>
-        <w:spacing w:before="0" w:after="120"/>
+        <w:spacing w:after="120"/>
       </w:pPr>
       <w:r>
         <w:rPr>
@@ -3188,8 +3170,8 @@
     </w:p>
     <w:tbl>
       <w:tblPr>
-        <w:tblW w:type="auto" w:w="0"/>
-        <w:tblLook w:firstColumn="1" w:firstRow="1" w:lastColumn="0" w:lastRow="0" w:noHBand="0" w:noVBand="1" w:val="04A0"/>
+        <w:tblW w:w="0" w:type="auto"/>
+        <w:tblLook w:val="04A0" w:firstRow="1" w:lastRow="0" w:firstColumn="1" w:lastColumn="0" w:noHBand="0" w:noVBand="1"/>
       </w:tblPr>
       <w:tblGrid>
         <w:gridCol w:w="9792"/>
@@ -3197,7 +3179,13 @@
       <w:tr>
         <w:tc>
           <w:tcPr>
-            <w:tcW w:type="dxa" w:w="9792"/>
+            <w:tcW w:w="9792" w:type="dxa"/>
+            <w:tcBorders>
+              <w:top w:val="single" w:sz="4" w:space="0" w:color="E2E8F0"/>
+              <w:left w:val="single" w:sz="18" w:space="0" w:color="3B82F6"/>
+              <w:bottom w:val="single" w:sz="4" w:space="0" w:color="E2E8F0"/>
+              <w:right w:val="single" w:sz="4" w:space="0" w:color="E2E8F0"/>
+            </w:tcBorders>
             <w:shd w:val="clear" w:color="auto" w:fill="F1F5F9"/>
             <w:tcMar>
               <w:top w:w="120" w:type="dxa"/>
@@ -3205,12 +3193,6 @@
               <w:bottom w:w="120" w:type="dxa"/>
               <w:right w:w="160" w:type="dxa"/>
             </w:tcMar>
-            <w:tcBorders>
-              <w:top w:val="single" w:sz="4" w:space="0" w:color="E2E8F0"/>
-              <w:left w:val="single" w:sz="18" w:space="0" w:color="3B82F6"/>
-              <w:bottom w:val="single" w:sz="4" w:space="0" w:color="E2E8F0"/>
-              <w:right w:val="single" w:sz="4" w:space="0" w:color="E2E8F0"/>
-            </w:tcBorders>
           </w:tcPr>
           <w:p>
             <w:pPr>
@@ -3224,6 +3206,14 @@
                 <w:sz w:val="18"/>
               </w:rPr>
               <w:t>USER PROMPT TEXT:</w:t>
+            </w:r>
+            <w:r>
+              <w:rPr>
+                <w:rFonts w:ascii="Arial" w:hAnsi="Arial"/>
+                <w:b/>
+                <w:color w:val="1E293B"/>
+                <w:sz w:val="18"/>
+              </w:rPr>
               <w:br/>
             </w:r>
             <w:r>
@@ -3233,6 +3223,13 @@
                 <w:sz w:val="18"/>
               </w:rPr>
               <w:t>the FurBuddy answer somehow wrong!!! can you fix? I need the chatbot to answer correctly and somehow sounds friendly, not just answer like that</w:t>
+            </w:r>
+            <w:r>
+              <w:rPr>
+                <w:rFonts w:ascii="Arial" w:hAnsi="Arial"/>
+                <w:color w:val="0F172A"/>
+                <w:sz w:val="18"/>
+              </w:rPr>
               <w:br/>
               <w:t>[Follow-up Deploy Directive: "well i think you haven't push on github and i also haven't change the file to deploy"]</w:t>
             </w:r>
@@ -3380,6 +3377,7 @@
           <w:color w:val="334155"/>
           <w:sz w:val="18"/>
         </w:rPr>
+        <w:lastRenderedPageBreak/>
         <w:t xml:space="preserve">Dual-Engine Harmonization &amp; Production Deployment: </w:t>
       </w:r>
       <w:r>

</xml_diff>